<commit_message>
Docs: Work log update
Edit the work log content
</commit_message>
<xml_diff>
--- a/Work/2021180023_LKA/WorkLog/이규아_작업일지_1주차.docx
+++ b/Work/2021180023_LKA/WorkLog/이규아_작업일지_1주차.docx
@@ -1,6 +1,6 @@
 
 <file path=word/document.xml><?xml version="1.0" encoding="utf-8"?>
-<w:document xmlns:wpc="http://schemas.microsoft.com/office/word/2010/wordprocessingCanvas" xmlns:cx="http://schemas.microsoft.com/office/drawing/2014/chartex" xmlns:cx1="http://schemas.microsoft.com/office/drawing/2015/9/8/chartex" xmlns:mc="http://schemas.openxmlformats.org/markup-compatibility/2006" xmlns:o="urn:schemas-microsoft-com:office:office" xmlns:r="http://schemas.openxmlformats.org/officeDocument/2006/relationships" xmlns:m="http://schemas.openxmlformats.org/officeDocument/2006/math" xmlns:v="urn:schemas-microsoft-com:vml" xmlns:wp14="http://schemas.microsoft.com/office/word/2010/wordprocessingDrawing" xmlns:wp="http://schemas.openxmlformats.org/drawingml/2006/wordprocessingDrawing" xmlns:w10="urn:schemas-microsoft-com:office:word" xmlns:w="http://schemas.openxmlformats.org/wordprocessingml/2006/main" xmlns:w14="http://schemas.microsoft.com/office/word/2010/wordml" xmlns:w15="http://schemas.microsoft.com/office/word/2012/wordml" xmlns:w16se="http://schemas.microsoft.com/office/word/2015/wordml/symex" xmlns:wpg="http://schemas.microsoft.com/office/word/2010/wordprocessingGroup" xmlns:wpi="http://schemas.microsoft.com/office/word/2010/wordprocessingInk" xmlns:wne="http://schemas.microsoft.com/office/word/2006/wordml" xmlns:wps="http://schemas.microsoft.com/office/word/2010/wordprocessingShape" mc:Ignorable="w14 w15 w16se wp14">
+<w:document xmlns:wpc="http://schemas.microsoft.com/office/word/2010/wordprocessingCanvas" xmlns:cx="http://schemas.microsoft.com/office/drawing/2014/chartex" xmlns:cx1="http://schemas.microsoft.com/office/drawing/2015/9/8/chartex" xmlns:cx2="http://schemas.microsoft.com/office/drawing/2015/10/21/chartex" xmlns:cx3="http://schemas.microsoft.com/office/drawing/2016/5/9/chartex" xmlns:cx4="http://schemas.microsoft.com/office/drawing/2016/5/10/chartex" xmlns:cx5="http://schemas.microsoft.com/office/drawing/2016/5/11/chartex" xmlns:cx6="http://schemas.microsoft.com/office/drawing/2016/5/12/chartex" xmlns:cx7="http://schemas.microsoft.com/office/drawing/2016/5/13/chartex" xmlns:cx8="http://schemas.microsoft.com/office/drawing/2016/5/14/chartex" xmlns:mc="http://schemas.openxmlformats.org/markup-compatibility/2006" xmlns:aink="http://schemas.microsoft.com/office/drawing/2016/ink" xmlns:am3d="http://schemas.microsoft.com/office/drawing/2017/model3d" xmlns:o="urn:schemas-microsoft-com:office:office" xmlns:oel="http://schemas.microsoft.com/office/2019/extlst" xmlns:r="http://schemas.openxmlformats.org/officeDocument/2006/relationships" xmlns:m="http://schemas.openxmlformats.org/officeDocument/2006/math" xmlns:v="urn:schemas-microsoft-com:vml" xmlns:wp14="http://schemas.microsoft.com/office/word/2010/wordprocessingDrawing" xmlns:wp="http://schemas.openxmlformats.org/drawingml/2006/wordprocessingDrawing" xmlns:w10="urn:schemas-microsoft-com:office:word" xmlns:w="http://schemas.openxmlformats.org/wordprocessingml/2006/main" xmlns:w14="http://schemas.microsoft.com/office/word/2010/wordml" xmlns:w15="http://schemas.microsoft.com/office/word/2012/wordml" xmlns:w16cex="http://schemas.microsoft.com/office/word/2018/wordml/cex" xmlns:w16cid="http://schemas.microsoft.com/office/word/2016/wordml/cid" xmlns:w16="http://schemas.microsoft.com/office/word/2018/wordml" xmlns:w16du="http://schemas.microsoft.com/office/word/2023/wordml/word16du" xmlns:w16sdtdh="http://schemas.microsoft.com/office/word/2020/wordml/sdtdatahash" xmlns:w16sdtfl="http://schemas.microsoft.com/office/word/2024/wordml/sdtformatlock" xmlns:w16se="http://schemas.microsoft.com/office/word/2015/wordml/symex" xmlns:wpg="http://schemas.microsoft.com/office/word/2010/wordprocessingGroup" xmlns:wpi="http://schemas.microsoft.com/office/word/2010/wordprocessingInk" xmlns:wne="http://schemas.microsoft.com/office/word/2006/wordml" xmlns:wps="http://schemas.microsoft.com/office/word/2010/wordprocessingShape" mc:Ignorable="w14 w15 w16se w16cid w16 w16cex w16sdtdh w16sdtfl w16du wp14">
   <w:body>
     <w:tbl>
       <w:tblPr>
@@ -52,7 +52,10 @@
           </w:tcPr>
           <w:p>
             <w:r>
-              <w:t>30</w:t>
+              <w:rPr>
+                <w:rFonts w:hint="eastAsia"/>
+              </w:rPr>
+              <w:t>1</w:t>
             </w:r>
             <w:r>
               <w:rPr>
@@ -95,13 +98,31 @@
               <w:t>2</w:t>
             </w:r>
             <w:r>
-              <w:t>025.03</w:t>
+              <w:t>02</w:t>
+            </w:r>
+            <w:r>
+              <w:rPr>
+                <w:rFonts w:hint="eastAsia"/>
+              </w:rPr>
+              <w:t>6</w:t>
+            </w:r>
+            <w:r>
+              <w:t>.0</w:t>
+            </w:r>
+            <w:r>
+              <w:rPr>
+                <w:rFonts w:hint="eastAsia"/>
+              </w:rPr>
+              <w:t>9</w:t>
             </w:r>
             <w:r>
               <w:t>.</w:t>
             </w:r>
             <w:r>
-              <w:t>24</w:t>
+              <w:rPr>
+                <w:rFonts w:hint="eastAsia"/>
+              </w:rPr>
+              <w:t>02</w:t>
             </w:r>
           </w:p>
           <w:p>
@@ -111,10 +132,25 @@
           </w:p>
           <w:p>
             <w:r>
-              <w:t>2025.</w:t>
-            </w:r>
-            <w:r>
-              <w:t>03.30</w:t>
+              <w:t>202</w:t>
+            </w:r>
+            <w:r>
+              <w:rPr>
+                <w:rFonts w:hint="eastAsia"/>
+              </w:rPr>
+              <w:t>6</w:t>
+            </w:r>
+            <w:r>
+              <w:t>.</w:t>
+            </w:r>
+            <w:r>
+              <w:t>0</w:t>
+            </w:r>
+            <w:r>
+              <w:rPr>
+                <w:rFonts w:hint="eastAsia"/>
+              </w:rPr>
+              <w:t>9.08</w:t>
             </w:r>
           </w:p>
         </w:tc>
@@ -185,10 +221,24 @@
               </w:tabs>
             </w:pPr>
             <w:r>
-              <w:t xml:space="preserve">1. </w:t>
-            </w:r>
-            <w:r>
-              <w:t>캐릭터 완성</w:t>
+              <w:rPr>
+                <w:rFonts w:hint="eastAsia"/>
+              </w:rPr>
+              <w:t>1. 언리얼 버전 업데이트</w:t>
+            </w:r>
+          </w:p>
+          <w:p>
+            <w:r>
+              <w:rPr>
+                <w:rFonts w:hint="eastAsia"/>
+              </w:rPr>
+              <w:t xml:space="preserve">2. </w:t>
+            </w:r>
+            <w:r>
+              <w:rPr>
+                <w:rFonts w:hint="eastAsia"/>
+              </w:rPr>
+              <w:t>프로젝트 버그 픽스</w:t>
             </w:r>
           </w:p>
           <w:p>
@@ -201,63 +251,27 @@
               <w:rPr>
                 <w:rFonts w:hint="eastAsia"/>
               </w:rPr>
-              <w:t>2</w:t>
-            </w:r>
-            <w:r>
-              <w:t>. 몬스터</w:t>
-            </w:r>
-            <w:r>
-              <w:rPr>
-                <w:rFonts w:hint="eastAsia"/>
-              </w:rPr>
-              <w:t xml:space="preserve"> 구현</w:t>
+              <w:t xml:space="preserve">3. </w:t>
+            </w:r>
+            <w:r>
+              <w:rPr>
+                <w:rFonts w:hint="eastAsia"/>
+              </w:rPr>
+              <w:t>졸</w:t>
+            </w:r>
+            <w:r>
+              <w:rPr>
+                <w:rFonts w:hint="eastAsia"/>
+              </w:rPr>
+              <w:t>업작품</w:t>
+            </w:r>
+            <w:r>
+              <w:rPr>
+                <w:rFonts w:hint="eastAsia"/>
+              </w:rPr>
+              <w:t xml:space="preserve"> 회의 진행</w:t>
             </w:r>
           </w:p>
-          <w:p>
-            <w:pPr>
-              <w:tabs>
-                <w:tab w:val="left" w:pos="2765"/>
-              </w:tabs>
-            </w:pPr>
-            <w:r>
-              <w:rPr>
-                <w:rFonts w:hint="eastAsia"/>
-              </w:rPr>
-              <w:t>3</w:t>
-            </w:r>
-            <w:r>
-              <w:t>. 버그</w:t>
-            </w:r>
-            <w:r>
-              <w:rPr>
-                <w:rFonts w:hint="eastAsia"/>
-              </w:rPr>
-              <w:t xml:space="preserve"> 수정</w:t>
-            </w:r>
-          </w:p>
-          <w:p>
-            <w:pPr>
-              <w:tabs>
-                <w:tab w:val="left" w:pos="2765"/>
-              </w:tabs>
-            </w:pPr>
-            <w:r>
-              <w:rPr>
-                <w:rFonts w:hint="eastAsia"/>
-              </w:rPr>
-              <w:t>4</w:t>
-            </w:r>
-            <w:r>
-              <w:t>. 리듬</w:t>
-            </w:r>
-            <w:r>
-              <w:rPr>
-                <w:rFonts w:hint="eastAsia"/>
-              </w:rPr>
-              <w:t xml:space="preserve"> 변경 시스템</w:t>
-            </w:r>
-          </w:p>
-          <w:p/>
         </w:tc>
       </w:tr>
     </w:tbl>
@@ -277,9 +291,16 @@
         <w:tabs>
           <w:tab w:val="left" w:pos="2765"/>
         </w:tabs>
-      </w:pPr>
-      <w:r>
-        <w:t>1. 캐릭터 완성</w:t>
+        <w:spacing w:after="0" w:line="240" w:lineRule="auto"/>
+      </w:pPr>
+      <w:r>
+        <w:t xml:space="preserve">1. </w:t>
+      </w:r>
+      <w:r>
+        <w:rPr>
+          <w:rFonts w:hint="eastAsia"/>
+        </w:rPr>
+        <w:t>언리얼 버전 업데이트</w:t>
       </w:r>
     </w:p>
     <w:p>
@@ -292,25 +313,13 @@
         <w:rPr>
           <w:rFonts w:hint="eastAsia"/>
         </w:rPr>
-        <w:t xml:space="preserve"> 캐릭터의 기본 공격</w:t>
-      </w:r>
-      <w:r>
-        <w:t>, 스킬</w:t>
+        <w:t xml:space="preserve"> </w:t>
       </w:r>
       <w:r>
         <w:rPr>
           <w:rFonts w:hint="eastAsia"/>
         </w:rPr>
-        <w:t>,</w:t>
-      </w:r>
-      <w:r>
-        <w:t xml:space="preserve"> 버프</w:t>
-      </w:r>
-      <w:r>
-        <w:rPr>
-          <w:rFonts w:hint="eastAsia"/>
-        </w:rPr>
-        <w:t xml:space="preserve"> 시스템 등 캐릭터가 기본적으로 가져야 할 기능들 모두 구현</w:t>
+        <w:t>기존 개발한 프로젝트의 언리얼 버전을 5.7에서 5.8로 업데이트 및 빌드 버전 수정</w:t>
       </w:r>
     </w:p>
     <w:p>
@@ -333,13 +342,13 @@
         <w:t>2</w:t>
       </w:r>
       <w:r>
-        <w:t>. 몬스터</w:t>
+        <w:t xml:space="preserve">. </w:t>
       </w:r>
       <w:r>
         <w:rPr>
           <w:rFonts w:hint="eastAsia"/>
         </w:rPr>
-        <w:t xml:space="preserve"> 구현</w:t>
+        <w:t>프로젝트 버그 픽스</w:t>
       </w:r>
     </w:p>
     <w:p>
@@ -347,242 +356,164 @@
         <w:tabs>
           <w:tab w:val="left" w:pos="2765"/>
         </w:tabs>
+        <w:ind w:firstLine="195"/>
       </w:pPr>
       <w:r>
         <w:rPr>
           <w:rFonts w:hint="eastAsia"/>
         </w:rPr>
-        <w:t xml:space="preserve"> 기본 몬스터 한 종류의 공격과</w:t>
-      </w:r>
-      <w:r>
-        <w:t>, 애니메이션</w:t>
-      </w:r>
+        <w:t>언리얼 버전 업데이트 도중 생긴 플레이어 이동</w:t>
+      </w:r>
+      <w:r>
+        <w:rPr>
+          <w:rFonts w:hint="eastAsia"/>
+        </w:rPr>
+        <w:t>이 안되는</w:t>
+      </w:r>
+      <w:r>
+        <w:rPr>
+          <w:rFonts w:hint="eastAsia"/>
+        </w:rPr>
+        <w:t xml:space="preserve"> 문제, NavMesh 리메시 해결</w:t>
+      </w:r>
+    </w:p>
+    <w:p>
+      <w:pPr>
+        <w:tabs>
+          <w:tab w:val="left" w:pos="2765"/>
+        </w:tabs>
+        <w:ind w:firstLine="195"/>
+      </w:pPr>
+      <w:r>
+        <w:rPr>
+          <w:rFonts w:hint="eastAsia"/>
+        </w:rPr>
+        <w:t>프로젝트 빌드</w:t>
+      </w:r>
+      <w:r>
+        <w:rPr>
+          <w:rFonts w:hint="eastAsia"/>
+        </w:rPr>
+        <w:t xml:space="preserve"> -&gt; 컴파일 안되는</w:t>
+      </w:r>
+      <w:r>
+        <w:rPr>
+          <w:rFonts w:hint="eastAsia"/>
+        </w:rPr>
+        <w:t xml:space="preserve"> 문제, </w:t>
+      </w:r>
+      <w:r>
+        <w:rPr>
+          <w:rFonts w:hint="eastAsia"/>
+        </w:rPr>
+        <w:t>에디터 파일 수정</w:t>
+      </w:r>
+    </w:p>
+    <w:p>
+      <w:pPr>
+        <w:tabs>
+          <w:tab w:val="left" w:pos="2765"/>
+        </w:tabs>
+        <w:ind w:firstLine="195"/>
+      </w:pPr>
+      <w:r>
+        <w:rPr>
+          <w:rFonts w:hint="eastAsia"/>
+        </w:rPr>
+        <w:t xml:space="preserve">업데이트 후 기능이 제대로 </w:t>
+      </w:r>
+      <w:r>
+        <w:rPr>
+          <w:rFonts w:hint="eastAsia"/>
+        </w:rPr>
+        <w:t xml:space="preserve">구동되는지 </w:t>
+      </w:r>
+      <w:r>
+        <w:rPr>
+          <w:rFonts w:hint="eastAsia"/>
+        </w:rPr>
+        <w:t>테스트 및 확인</w:t>
+      </w:r>
+    </w:p>
+    <w:p>
+      <w:pPr>
+        <w:tabs>
+          <w:tab w:val="left" w:pos="2765"/>
+        </w:tabs>
+        <w:ind w:firstLine="195"/>
+      </w:pPr>
+    </w:p>
+    <w:p>
+      <w:pPr>
+        <w:tabs>
+          <w:tab w:val="left" w:pos="2765"/>
+        </w:tabs>
+      </w:pPr>
+      <w:r>
+        <w:rPr>
+          <w:rFonts w:hint="eastAsia"/>
+        </w:rPr>
+        <w:t>3</w:t>
+      </w:r>
+      <w:r>
+        <w:t xml:space="preserve">. </w:t>
+      </w:r>
+      <w:r>
+        <w:rPr>
+          <w:rFonts w:hint="eastAsia"/>
+        </w:rPr>
+        <w:t>졸업작품 회의 진행</w:t>
+      </w:r>
+    </w:p>
+    <w:p>
+      <w:pPr>
+        <w:tabs>
+          <w:tab w:val="left" w:pos="2765"/>
+        </w:tabs>
+      </w:pPr>
       <w:r>
         <w:rPr>
           <w:rFonts w:hint="eastAsia"/>
         </w:rPr>
         <w:t xml:space="preserve"> </w:t>
       </w:r>
-      <w:bookmarkStart w:id="0" w:name="_GoBack"/>
-      <w:bookmarkEnd w:id="0"/>
       <w:r>
         <w:rPr>
           <w:rFonts w:hint="eastAsia"/>
         </w:rPr>
-        <w:t>변경,</w:t>
-      </w:r>
-      <w:r>
-        <w:t xml:space="preserve"> 사망</w:t>
+        <w:t xml:space="preserve"> 게임 기획 내용 </w:t>
       </w:r>
       <w:r>
         <w:rPr>
           <w:rFonts w:hint="eastAsia"/>
         </w:rPr>
-        <w:t xml:space="preserve"> </w:t>
-      </w:r>
-      <w:proofErr w:type="spellStart"/>
+        <w:t>토의</w:t>
+      </w:r>
+    </w:p>
+    <w:p>
+      <w:pPr>
+        <w:tabs>
+          <w:tab w:val="left" w:pos="2765"/>
+        </w:tabs>
+        <w:ind w:firstLineChars="100" w:firstLine="200"/>
+      </w:pPr>
       <w:r>
         <w:rPr>
           <w:rFonts w:hint="eastAsia"/>
         </w:rPr>
-        <w:t>처리등을</w:t>
-      </w:r>
-      <w:proofErr w:type="spellEnd"/>
+        <w:t xml:space="preserve">적 AI </w:t>
+      </w:r>
       <w:r>
         <w:rPr>
           <w:rFonts w:hint="eastAsia"/>
         </w:rPr>
-        <w:t xml:space="preserve"> 추가</w:t>
-      </w:r>
-    </w:p>
-    <w:p>
-      <w:pPr>
-        <w:tabs>
-          <w:tab w:val="left" w:pos="2765"/>
-        </w:tabs>
-      </w:pPr>
-    </w:p>
-    <w:p>
-      <w:pPr>
-        <w:tabs>
-          <w:tab w:val="left" w:pos="2765"/>
-        </w:tabs>
-      </w:pPr>
+        <w:t xml:space="preserve">행동 패턴 및 </w:t>
+      </w:r>
       <w:r>
         <w:rPr>
           <w:rFonts w:hint="eastAsia"/>
         </w:rPr>
-        <w:t>3</w:t>
-      </w:r>
-      <w:r>
-        <w:t>. 버그</w:t>
-      </w:r>
-      <w:r>
-        <w:rPr>
-          <w:rFonts w:hint="eastAsia"/>
-        </w:rPr>
-        <w:t xml:space="preserve"> 수정</w:t>
-      </w:r>
-    </w:p>
-    <w:p>
-      <w:pPr>
-        <w:tabs>
-          <w:tab w:val="left" w:pos="2765"/>
-        </w:tabs>
-      </w:pPr>
-      <w:r>
-        <w:rPr>
-          <w:rFonts w:hint="eastAsia"/>
-        </w:rPr>
-        <w:t xml:space="preserve"> </w:t>
-      </w:r>
-      <w:r>
-        <w:t xml:space="preserve">1) </w:t>
-      </w:r>
-      <w:proofErr w:type="spellStart"/>
-      <w:r>
-        <w:rPr>
-          <w:rFonts w:hint="eastAsia"/>
-        </w:rPr>
-        <w:t>n</w:t>
-      </w:r>
-      <w:r>
-        <w:t>avmesh</w:t>
-      </w:r>
-      <w:proofErr w:type="spellEnd"/>
-      <w:r>
-        <w:t>를</w:t>
-      </w:r>
-      <w:r>
-        <w:rPr>
-          <w:rFonts w:hint="eastAsia"/>
-        </w:rPr>
-        <w:t xml:space="preserve"> 적용하면서 생긴 중력이 적용되지 않던 문제를 해결</w:t>
-      </w:r>
-    </w:p>
-    <w:p>
-      <w:pPr>
-        <w:tabs>
-          <w:tab w:val="left" w:pos="2765"/>
-        </w:tabs>
-      </w:pPr>
-      <w:r>
-        <w:rPr>
-          <w:rFonts w:hint="eastAsia"/>
-        </w:rPr>
-        <w:t xml:space="preserve"> </w:t>
-      </w:r>
-      <w:r>
-        <w:t>2) 1번</w:t>
-      </w:r>
-      <w:r>
-        <w:rPr>
-          <w:rFonts w:hint="eastAsia"/>
-        </w:rPr>
-        <w:t xml:space="preserve"> 문제를 해결하면서 생긴 몬스터의 </w:t>
-      </w:r>
-      <w:r>
-        <w:t>y좌표가</w:t>
-      </w:r>
-      <w:r>
-        <w:rPr>
-          <w:rFonts w:hint="eastAsia"/>
-        </w:rPr>
-        <w:t xml:space="preserve"> </w:t>
-      </w:r>
-      <w:r>
-        <w:t>0으로</w:t>
-      </w:r>
-      <w:r>
-        <w:rPr>
-          <w:rFonts w:hint="eastAsia"/>
-        </w:rPr>
-        <w:t xml:space="preserve"> 변경되는 문제 해결</w:t>
-      </w:r>
-    </w:p>
-    <w:p>
-      <w:pPr>
-        <w:tabs>
-          <w:tab w:val="left" w:pos="2765"/>
-        </w:tabs>
-      </w:pPr>
-      <w:r>
-        <w:rPr>
-          <w:rFonts w:hint="eastAsia"/>
-        </w:rPr>
-        <w:t xml:space="preserve"> </w:t>
-      </w:r>
-      <w:r>
-        <w:t>3) 이동하면서</w:t>
-      </w:r>
-      <w:r>
-        <w:rPr>
-          <w:rFonts w:hint="eastAsia"/>
-        </w:rPr>
-        <w:t xml:space="preserve"> 특정 애니메이션을 진행하면 반복 재생되던 버그 해결</w:t>
-      </w:r>
-    </w:p>
-    <w:p>
-      <w:pPr>
-        <w:tabs>
-          <w:tab w:val="left" w:pos="2765"/>
-        </w:tabs>
-      </w:pPr>
-    </w:p>
-    <w:p>
-      <w:pPr>
-        <w:tabs>
-          <w:tab w:val="left" w:pos="2765"/>
-        </w:tabs>
-      </w:pPr>
-      <w:r>
-        <w:rPr>
-          <w:rFonts w:hint="eastAsia"/>
-        </w:rPr>
-        <w:t>4</w:t>
-      </w:r>
-      <w:r>
-        <w:t>. 리듬</w:t>
-      </w:r>
-      <w:r>
-        <w:rPr>
-          <w:rFonts w:hint="eastAsia"/>
-        </w:rPr>
-        <w:t xml:space="preserve"> 변경 시스템</w:t>
-      </w:r>
-    </w:p>
-    <w:p>
-      <w:pPr>
-        <w:tabs>
-          <w:tab w:val="left" w:pos="2765"/>
-        </w:tabs>
-      </w:pPr>
-      <w:r>
-        <w:rPr>
-          <w:rFonts w:hint="eastAsia"/>
-        </w:rPr>
-        <w:t xml:space="preserve"> 플레이어가 리듬을 변경하게 된다면 실제로 음악도 변경되도록 함</w:t>
-      </w:r>
-      <w:r>
-        <w:t>, 기존에</w:t>
-      </w:r>
-      <w:r>
-        <w:rPr>
-          <w:rFonts w:hint="eastAsia"/>
-        </w:rPr>
-        <w:t xml:space="preserve"> 서버에서 하던 리듬 변경을 클라이언트에서 진행 후에 변경된 리듬만 서버로 보내 확인 후 변경된 리듬의 버프를 적용하도록 수정</w:t>
-      </w:r>
-    </w:p>
-    <w:p/>
-    <w:p>
-      <w:r>
-        <w:rPr>
-          <w:rFonts w:hint="eastAsia"/>
-        </w:rPr>
-        <w:t>진행 상황 유튜브 링크</w:t>
-      </w:r>
-      <w:r>
-        <w:t xml:space="preserve">: </w:t>
+        <w:t>기술요소 관련 회의</w:t>
       </w:r>
     </w:p>
     <w:tbl>
@@ -615,7 +546,6 @@
                 <w:b/>
                 <w:bCs/>
               </w:rPr>
-              <w:lastRenderedPageBreak/>
               <w:t>문제점 정리</w:t>
             </w:r>
           </w:p>
@@ -686,7 +616,10 @@
           </w:tcPr>
           <w:p>
             <w:r>
-              <w:t>31</w:t>
+              <w:rPr>
+                <w:rFonts w:hint="eastAsia"/>
+              </w:rPr>
+              <w:t>2</w:t>
             </w:r>
             <w:r>
               <w:rPr>
@@ -729,16 +662,31 @@
               <w:t>2</w:t>
             </w:r>
             <w:r>
-              <w:t>025.3</w:t>
+              <w:t>02</w:t>
+            </w:r>
+            <w:r>
+              <w:rPr>
+                <w:rFonts w:hint="eastAsia"/>
+              </w:rPr>
+              <w:t>6</w:t>
+            </w:r>
+            <w:r>
+              <w:t>.0</w:t>
+            </w:r>
+            <w:r>
+              <w:rPr>
+                <w:rFonts w:hint="eastAsia"/>
+              </w:rPr>
+              <w:t>9</w:t>
             </w:r>
             <w:r>
               <w:t>.</w:t>
             </w:r>
             <w:r>
-              <w:t>31</w:t>
-            </w:r>
-            <w:r>
-              <w:t xml:space="preserve"> </w:t>
+              <w:rPr>
+                <w:rFonts w:hint="eastAsia"/>
+              </w:rPr>
+              <w:t>09</w:t>
             </w:r>
           </w:p>
           <w:p>
@@ -748,13 +696,22 @@
           </w:p>
           <w:p>
             <w:r>
-              <w:t>2025.4</w:t>
-            </w:r>
-            <w:r>
-              <w:t>.</w:t>
-            </w:r>
-            <w:r>
-              <w:t>06</w:t>
+              <w:t>202</w:t>
+            </w:r>
+            <w:r>
+              <w:rPr>
+                <w:rFonts w:hint="eastAsia"/>
+              </w:rPr>
+              <w:t>6</w:t>
+            </w:r>
+            <w:r>
+              <w:t>.0</w:t>
+            </w:r>
+            <w:r>
+              <w:rPr>
+                <w:rFonts w:hint="eastAsia"/>
+              </w:rPr>
+              <w:t>9.15</w:t>
             </w:r>
           </w:p>
         </w:tc>
@@ -799,27 +756,50 @@
               <w:rPr>
                 <w:rFonts w:hint="eastAsia"/>
               </w:rPr>
-              <w:t>1</w:t>
-            </w:r>
-            <w:r>
+              <w:t xml:space="preserve">1. </w:t>
+            </w:r>
+            <w:r>
+              <w:rPr>
+                <w:rFonts w:hint="eastAsia"/>
+              </w:rPr>
+              <w:t>프로젝트 MCP 서버 연결 및 AI 에이전트</w:t>
+            </w:r>
+            <w:r>
+              <w:rPr>
+                <w:rFonts w:hint="eastAsia"/>
+              </w:rPr>
+              <w:t xml:space="preserve"> 활용</w:t>
+            </w:r>
+          </w:p>
+          <w:p>
+            <w:pPr>
+              <w:tabs>
+                <w:tab w:val="left" w:pos="2765"/>
+              </w:tabs>
+            </w:pPr>
+            <w:r>
+              <w:rPr>
+                <w:rFonts w:hint="eastAsia"/>
+              </w:rPr>
+              <w:t>2</w:t>
+            </w:r>
+            <w:r>
+              <w:rPr>
+                <w:rFonts w:hint="eastAsia"/>
+              </w:rPr>
               <w:t xml:space="preserve">. </w:t>
             </w:r>
             <w:r>
-              <w:t>중점연구(</w:t>
-            </w:r>
-            <w:proofErr w:type="spellStart"/>
-            <w:r>
-              <w:rPr>
-                <w:rFonts w:hint="eastAsia"/>
-              </w:rPr>
-              <w:t>a</w:t>
-            </w:r>
-            <w:r>
-              <w:t>i</w:t>
-            </w:r>
-            <w:proofErr w:type="spellEnd"/>
-            <w:r>
-              <w:t>) 진행</w:t>
+              <w:rPr>
+                <w:rFonts w:hint="eastAsia"/>
+              </w:rPr>
+              <w:t xml:space="preserve">조력자 AI </w:t>
+            </w:r>
+            <w:r>
+              <w:rPr>
+                <w:rFonts w:hint="eastAsia"/>
+              </w:rPr>
+              <w:t>행동 설계</w:t>
             </w:r>
           </w:p>
         </w:tc>
@@ -894,7 +874,7 @@
 </file>
 
 <file path=word/endnotes.xml><?xml version="1.0" encoding="utf-8"?>
-<w:endnotes xmlns:wpc="http://schemas.microsoft.com/office/word/2010/wordprocessingCanvas" xmlns:cx="http://schemas.microsoft.com/office/drawing/2014/chartex" xmlns:cx1="http://schemas.microsoft.com/office/drawing/2015/9/8/chartex" xmlns:mc="http://schemas.openxmlformats.org/markup-compatibility/2006" xmlns:o="urn:schemas-microsoft-com:office:office" xmlns:r="http://schemas.openxmlformats.org/officeDocument/2006/relationships" xmlns:m="http://schemas.openxmlformats.org/officeDocument/2006/math" xmlns:v="urn:schemas-microsoft-com:vml" xmlns:wp14="http://schemas.microsoft.com/office/word/2010/wordprocessingDrawing" xmlns:wp="http://schemas.openxmlformats.org/drawingml/2006/wordprocessingDrawing" xmlns:w10="urn:schemas-microsoft-com:office:word" xmlns:w="http://schemas.openxmlformats.org/wordprocessingml/2006/main" xmlns:w14="http://schemas.microsoft.com/office/word/2010/wordml" xmlns:w15="http://schemas.microsoft.com/office/word/2012/wordml" xmlns:w16se="http://schemas.microsoft.com/office/word/2015/wordml/symex" xmlns:wpg="http://schemas.microsoft.com/office/word/2010/wordprocessingGroup" xmlns:wpi="http://schemas.microsoft.com/office/word/2010/wordprocessingInk" xmlns:wne="http://schemas.microsoft.com/office/word/2006/wordml" xmlns:wps="http://schemas.microsoft.com/office/word/2010/wordprocessingShape" mc:Ignorable="w14 w15 w16se wp14">
+<w:endnotes xmlns:wpc="http://schemas.microsoft.com/office/word/2010/wordprocessingCanvas" xmlns:cx="http://schemas.microsoft.com/office/drawing/2014/chartex" xmlns:cx1="http://schemas.microsoft.com/office/drawing/2015/9/8/chartex" xmlns:cx2="http://schemas.microsoft.com/office/drawing/2015/10/21/chartex" xmlns:cx3="http://schemas.microsoft.com/office/drawing/2016/5/9/chartex" xmlns:cx4="http://schemas.microsoft.com/office/drawing/2016/5/10/chartex" xmlns:cx5="http://schemas.microsoft.com/office/drawing/2016/5/11/chartex" xmlns:cx6="http://schemas.microsoft.com/office/drawing/2016/5/12/chartex" xmlns:cx7="http://schemas.microsoft.com/office/drawing/2016/5/13/chartex" xmlns:cx8="http://schemas.microsoft.com/office/drawing/2016/5/14/chartex" xmlns:mc="http://schemas.openxmlformats.org/markup-compatibility/2006" xmlns:aink="http://schemas.microsoft.com/office/drawing/2016/ink" xmlns:am3d="http://schemas.microsoft.com/office/drawing/2017/model3d" xmlns:o="urn:schemas-microsoft-com:office:office" xmlns:oel="http://schemas.microsoft.com/office/2019/extlst" xmlns:r="http://schemas.openxmlformats.org/officeDocument/2006/relationships" xmlns:m="http://schemas.openxmlformats.org/officeDocument/2006/math" xmlns:v="urn:schemas-microsoft-com:vml" xmlns:wp14="http://schemas.microsoft.com/office/word/2010/wordprocessingDrawing" xmlns:wp="http://schemas.openxmlformats.org/drawingml/2006/wordprocessingDrawing" xmlns:w10="urn:schemas-microsoft-com:office:word" xmlns:w="http://schemas.openxmlformats.org/wordprocessingml/2006/main" xmlns:w14="http://schemas.microsoft.com/office/word/2010/wordml" xmlns:w15="http://schemas.microsoft.com/office/word/2012/wordml" xmlns:w16cex="http://schemas.microsoft.com/office/word/2018/wordml/cex" xmlns:w16cid="http://schemas.microsoft.com/office/word/2016/wordml/cid" xmlns:w16="http://schemas.microsoft.com/office/word/2018/wordml" xmlns:w16du="http://schemas.microsoft.com/office/word/2023/wordml/word16du" xmlns:w16sdtdh="http://schemas.microsoft.com/office/word/2020/wordml/sdtdatahash" xmlns:w16sdtfl="http://schemas.microsoft.com/office/word/2024/wordml/sdtformatlock" xmlns:w16se="http://schemas.microsoft.com/office/word/2015/wordml/symex" xmlns:wpg="http://schemas.microsoft.com/office/word/2010/wordprocessingGroup" xmlns:wpi="http://schemas.microsoft.com/office/word/2010/wordprocessingInk" xmlns:wne="http://schemas.microsoft.com/office/word/2006/wordml" xmlns:wps="http://schemas.microsoft.com/office/word/2010/wordprocessingShape" mc:Ignorable="w14 w15 w16se w16cid w16 w16cex w16sdtdh w16sdtfl w16du wp14">
   <w:endnote w:type="separator" w:id="-1">
     <w:p>
       <w:pPr>
@@ -919,7 +899,7 @@
 </file>
 
 <file path=word/footnotes.xml><?xml version="1.0" encoding="utf-8"?>
-<w:footnotes xmlns:wpc="http://schemas.microsoft.com/office/word/2010/wordprocessingCanvas" xmlns:cx="http://schemas.microsoft.com/office/drawing/2014/chartex" xmlns:cx1="http://schemas.microsoft.com/office/drawing/2015/9/8/chartex" xmlns:mc="http://schemas.openxmlformats.org/markup-compatibility/2006" xmlns:o="urn:schemas-microsoft-com:office:office" xmlns:r="http://schemas.openxmlformats.org/officeDocument/2006/relationships" xmlns:m="http://schemas.openxmlformats.org/officeDocument/2006/math" xmlns:v="urn:schemas-microsoft-com:vml" xmlns:wp14="http://schemas.microsoft.com/office/word/2010/wordprocessingDrawing" xmlns:wp="http://schemas.openxmlformats.org/drawingml/2006/wordprocessingDrawing" xmlns:w10="urn:schemas-microsoft-com:office:word" xmlns:w="http://schemas.openxmlformats.org/wordprocessingml/2006/main" xmlns:w14="http://schemas.microsoft.com/office/word/2010/wordml" xmlns:w15="http://schemas.microsoft.com/office/word/2012/wordml" xmlns:w16se="http://schemas.microsoft.com/office/word/2015/wordml/symex" xmlns:wpg="http://schemas.microsoft.com/office/word/2010/wordprocessingGroup" xmlns:wpi="http://schemas.microsoft.com/office/word/2010/wordprocessingInk" xmlns:wne="http://schemas.microsoft.com/office/word/2006/wordml" xmlns:wps="http://schemas.microsoft.com/office/word/2010/wordprocessingShape" mc:Ignorable="w14 w15 w16se wp14">
+<w:footnotes xmlns:wpc="http://schemas.microsoft.com/office/word/2010/wordprocessingCanvas" xmlns:cx="http://schemas.microsoft.com/office/drawing/2014/chartex" xmlns:cx1="http://schemas.microsoft.com/office/drawing/2015/9/8/chartex" xmlns:cx2="http://schemas.microsoft.com/office/drawing/2015/10/21/chartex" xmlns:cx3="http://schemas.microsoft.com/office/drawing/2016/5/9/chartex" xmlns:cx4="http://schemas.microsoft.com/office/drawing/2016/5/10/chartex" xmlns:cx5="http://schemas.microsoft.com/office/drawing/2016/5/11/chartex" xmlns:cx6="http://schemas.microsoft.com/office/drawing/2016/5/12/chartex" xmlns:cx7="http://schemas.microsoft.com/office/drawing/2016/5/13/chartex" xmlns:cx8="http://schemas.microsoft.com/office/drawing/2016/5/14/chartex" xmlns:mc="http://schemas.openxmlformats.org/markup-compatibility/2006" xmlns:aink="http://schemas.microsoft.com/office/drawing/2016/ink" xmlns:am3d="http://schemas.microsoft.com/office/drawing/2017/model3d" xmlns:o="urn:schemas-microsoft-com:office:office" xmlns:oel="http://schemas.microsoft.com/office/2019/extlst" xmlns:r="http://schemas.openxmlformats.org/officeDocument/2006/relationships" xmlns:m="http://schemas.openxmlformats.org/officeDocument/2006/math" xmlns:v="urn:schemas-microsoft-com:vml" xmlns:wp14="http://schemas.microsoft.com/office/word/2010/wordprocessingDrawing" xmlns:wp="http://schemas.openxmlformats.org/drawingml/2006/wordprocessingDrawing" xmlns:w10="urn:schemas-microsoft-com:office:word" xmlns:w="http://schemas.openxmlformats.org/wordprocessingml/2006/main" xmlns:w14="http://schemas.microsoft.com/office/word/2010/wordml" xmlns:w15="http://schemas.microsoft.com/office/word/2012/wordml" xmlns:w16cex="http://schemas.microsoft.com/office/word/2018/wordml/cex" xmlns:w16cid="http://schemas.microsoft.com/office/word/2016/wordml/cid" xmlns:w16="http://schemas.microsoft.com/office/word/2018/wordml" xmlns:w16du="http://schemas.microsoft.com/office/word/2023/wordml/word16du" xmlns:w16sdtdh="http://schemas.microsoft.com/office/word/2020/wordml/sdtdatahash" xmlns:w16sdtfl="http://schemas.microsoft.com/office/word/2024/wordml/sdtformatlock" xmlns:w16se="http://schemas.microsoft.com/office/word/2015/wordml/symex" xmlns:wpg="http://schemas.microsoft.com/office/word/2010/wordprocessingGroup" xmlns:wpi="http://schemas.microsoft.com/office/word/2010/wordprocessingInk" xmlns:wne="http://schemas.microsoft.com/office/word/2006/wordml" xmlns:wps="http://schemas.microsoft.com/office/word/2010/wordprocessingShape" mc:Ignorable="w14 w15 w16se w16cid w16 w16cex w16sdtdh w16sdtfl w16du wp14">
   <w:footnote w:type="separator" w:id="-1">
     <w:p>
       <w:pPr>
@@ -944,7 +924,7 @@
 </file>
 
 <file path=word/header1.xml><?xml version="1.0" encoding="utf-8"?>
-<w:hdr xmlns:wpc="http://schemas.microsoft.com/office/word/2010/wordprocessingCanvas" xmlns:cx="http://schemas.microsoft.com/office/drawing/2014/chartex" xmlns:cx1="http://schemas.microsoft.com/office/drawing/2015/9/8/chartex" xmlns:mc="http://schemas.openxmlformats.org/markup-compatibility/2006" xmlns:o="urn:schemas-microsoft-com:office:office" xmlns:r="http://schemas.openxmlformats.org/officeDocument/2006/relationships" xmlns:m="http://schemas.openxmlformats.org/officeDocument/2006/math" xmlns:v="urn:schemas-microsoft-com:vml" xmlns:wp14="http://schemas.microsoft.com/office/word/2010/wordprocessingDrawing" xmlns:wp="http://schemas.openxmlformats.org/drawingml/2006/wordprocessingDrawing" xmlns:w10="urn:schemas-microsoft-com:office:word" xmlns:w="http://schemas.openxmlformats.org/wordprocessingml/2006/main" xmlns:w14="http://schemas.microsoft.com/office/word/2010/wordml" xmlns:w15="http://schemas.microsoft.com/office/word/2012/wordml" xmlns:w16se="http://schemas.microsoft.com/office/word/2015/wordml/symex" xmlns:wpg="http://schemas.microsoft.com/office/word/2010/wordprocessingGroup" xmlns:wpi="http://schemas.microsoft.com/office/word/2010/wordprocessingInk" xmlns:wne="http://schemas.microsoft.com/office/word/2006/wordml" xmlns:wps="http://schemas.microsoft.com/office/word/2010/wordprocessingShape" mc:Ignorable="w14 w15 w16se wp14">
+<w:hdr xmlns:wpc="http://schemas.microsoft.com/office/word/2010/wordprocessingCanvas" xmlns:cx="http://schemas.microsoft.com/office/drawing/2014/chartex" xmlns:cx1="http://schemas.microsoft.com/office/drawing/2015/9/8/chartex" xmlns:cx2="http://schemas.microsoft.com/office/drawing/2015/10/21/chartex" xmlns:cx3="http://schemas.microsoft.com/office/drawing/2016/5/9/chartex" xmlns:cx4="http://schemas.microsoft.com/office/drawing/2016/5/10/chartex" xmlns:cx5="http://schemas.microsoft.com/office/drawing/2016/5/11/chartex" xmlns:cx6="http://schemas.microsoft.com/office/drawing/2016/5/12/chartex" xmlns:cx7="http://schemas.microsoft.com/office/drawing/2016/5/13/chartex" xmlns:cx8="http://schemas.microsoft.com/office/drawing/2016/5/14/chartex" xmlns:mc="http://schemas.openxmlformats.org/markup-compatibility/2006" xmlns:aink="http://schemas.microsoft.com/office/drawing/2016/ink" xmlns:am3d="http://schemas.microsoft.com/office/drawing/2017/model3d" xmlns:o="urn:schemas-microsoft-com:office:office" xmlns:oel="http://schemas.microsoft.com/office/2019/extlst" xmlns:r="http://schemas.openxmlformats.org/officeDocument/2006/relationships" xmlns:m="http://schemas.openxmlformats.org/officeDocument/2006/math" xmlns:v="urn:schemas-microsoft-com:vml" xmlns:wp14="http://schemas.microsoft.com/office/word/2010/wordprocessingDrawing" xmlns:wp="http://schemas.openxmlformats.org/drawingml/2006/wordprocessingDrawing" xmlns:w10="urn:schemas-microsoft-com:office:word" xmlns:w="http://schemas.openxmlformats.org/wordprocessingml/2006/main" xmlns:w14="http://schemas.microsoft.com/office/word/2010/wordml" xmlns:w15="http://schemas.microsoft.com/office/word/2012/wordml" xmlns:w16cex="http://schemas.microsoft.com/office/word/2018/wordml/cex" xmlns:w16cid="http://schemas.microsoft.com/office/word/2016/wordml/cid" xmlns:w16="http://schemas.microsoft.com/office/word/2018/wordml" xmlns:w16du="http://schemas.microsoft.com/office/word/2023/wordml/word16du" xmlns:w16sdtdh="http://schemas.microsoft.com/office/word/2020/wordml/sdtdatahash" xmlns:w16sdtfl="http://schemas.microsoft.com/office/word/2024/wordml/sdtformatlock" xmlns:w16se="http://schemas.microsoft.com/office/word/2015/wordml/symex" xmlns:wpg="http://schemas.microsoft.com/office/word/2010/wordprocessingGroup" xmlns:wpi="http://schemas.microsoft.com/office/word/2010/wordprocessingInk" xmlns:wne="http://schemas.microsoft.com/office/word/2006/wordml" xmlns:wps="http://schemas.microsoft.com/office/word/2010/wordprocessingShape" mc:Ignorable="w14 w15 w16se w16cid w16 w16cex w16sdtdh w16sdtfl w16du wp14">
   <w:p>
     <w:pPr>
       <w:pStyle w:val="a3"/>
@@ -959,32 +939,32 @@
     <w:pPr>
       <w:pStyle w:val="a3"/>
       <w:rPr>
+        <w:b/>
+        <w:bCs/>
+      </w:rPr>
+    </w:pPr>
+    <w:r>
+      <w:rPr>
         <w:rFonts w:hint="eastAsia"/>
         <w:b/>
         <w:bCs/>
       </w:rPr>
-    </w:pPr>
+      <w:t>작성자(학번 이름</w:t>
+    </w:r>
+    <w:r>
+      <w:rPr>
+        <w:b/>
+        <w:bCs/>
+      </w:rPr>
+      <w:t xml:space="preserve">): </w:t>
+    </w:r>
     <w:r>
       <w:rPr>
         <w:rFonts w:hint="eastAsia"/>
         <w:b/>
         <w:bCs/>
       </w:rPr>
-      <w:t>작성자(학번 이름</w:t>
-    </w:r>
-    <w:r>
-      <w:rPr>
-        <w:b/>
-        <w:bCs/>
-      </w:rPr>
-      <w:t xml:space="preserve">): </w:t>
-    </w:r>
-    <w:r>
-      <w:rPr>
-        <w:b/>
-        <w:bCs/>
-      </w:rPr>
-      <w:t xml:space="preserve"> </w:t>
+      <w:t>2021180023 이규아</w:t>
     </w:r>
   </w:p>
   <w:p>
@@ -995,38 +975,214 @@
         <w:bCs/>
       </w:rPr>
     </w:pPr>
-    <w:proofErr w:type="spellStart"/>
     <w:r>
       <w:rPr>
         <w:rFonts w:hint="eastAsia"/>
         <w:b/>
         <w:bCs/>
       </w:rPr>
-      <w:t>팀명</w:t>
+      <w:t>팀명:</w:t>
     </w:r>
-    <w:proofErr w:type="spellEnd"/>
+    <w:r>
+      <w:rPr>
+        <w:b/>
+        <w:bCs/>
+      </w:rPr>
+      <w:t xml:space="preserve"> </w:t>
+    </w:r>
     <w:r>
       <w:rPr>
         <w:rFonts w:hint="eastAsia"/>
         <w:b/>
         <w:bCs/>
       </w:rPr>
-      <w:t>:</w:t>
-    </w:r>
-    <w:r>
-      <w:rPr>
-        <w:b/>
-        <w:bCs/>
-      </w:rPr>
-      <w:t xml:space="preserve"> </w:t>
+      <w:t>DSFD</w:t>
     </w:r>
   </w:p>
 </w:hdr>
 </file>
 
 <file path=word/numbering.xml><?xml version="1.0" encoding="utf-8"?>
-<w:numbering xmlns:wpc="http://schemas.microsoft.com/office/word/2010/wordprocessingCanvas" xmlns:cx="http://schemas.microsoft.com/office/drawing/2014/chartex" xmlns:cx1="http://schemas.microsoft.com/office/drawing/2015/9/8/chartex" xmlns:mc="http://schemas.openxmlformats.org/markup-compatibility/2006" xmlns:o="urn:schemas-microsoft-com:office:office" xmlns:r="http://schemas.openxmlformats.org/officeDocument/2006/relationships" xmlns:m="http://schemas.openxmlformats.org/officeDocument/2006/math" xmlns:v="urn:schemas-microsoft-com:vml" xmlns:wp14="http://schemas.microsoft.com/office/word/2010/wordprocessingDrawing" xmlns:wp="http://schemas.openxmlformats.org/drawingml/2006/wordprocessingDrawing" xmlns:w10="urn:schemas-microsoft-com:office:word" xmlns:w="http://schemas.openxmlformats.org/wordprocessingml/2006/main" xmlns:w14="http://schemas.microsoft.com/office/word/2010/wordml" xmlns:w15="http://schemas.microsoft.com/office/word/2012/wordml" xmlns:w16se="http://schemas.microsoft.com/office/word/2015/wordml/symex" xmlns:wpg="http://schemas.microsoft.com/office/word/2010/wordprocessingGroup" xmlns:wpi="http://schemas.microsoft.com/office/word/2010/wordprocessingInk" xmlns:wne="http://schemas.microsoft.com/office/word/2006/wordml" xmlns:wps="http://schemas.microsoft.com/office/word/2010/wordprocessingShape" mc:Ignorable="w14 w15 w16se wp14">
+<w:numbering xmlns:wpc="http://schemas.microsoft.com/office/word/2010/wordprocessingCanvas" xmlns:cx="http://schemas.microsoft.com/office/drawing/2014/chartex" xmlns:cx1="http://schemas.microsoft.com/office/drawing/2015/9/8/chartex" xmlns:cx2="http://schemas.microsoft.com/office/drawing/2015/10/21/chartex" xmlns:cx3="http://schemas.microsoft.com/office/drawing/2016/5/9/chartex" xmlns:cx4="http://schemas.microsoft.com/office/drawing/2016/5/10/chartex" xmlns:cx5="http://schemas.microsoft.com/office/drawing/2016/5/11/chartex" xmlns:cx6="http://schemas.microsoft.com/office/drawing/2016/5/12/chartex" xmlns:cx7="http://schemas.microsoft.com/office/drawing/2016/5/13/chartex" xmlns:cx8="http://schemas.microsoft.com/office/drawing/2016/5/14/chartex" xmlns:mc="http://schemas.openxmlformats.org/markup-compatibility/2006" xmlns:aink="http://schemas.microsoft.com/office/drawing/2016/ink" xmlns:am3d="http://schemas.microsoft.com/office/drawing/2017/model3d" xmlns:o="urn:schemas-microsoft-com:office:office" xmlns:oel="http://schemas.microsoft.com/office/2019/extlst" xmlns:r="http://schemas.openxmlformats.org/officeDocument/2006/relationships" xmlns:m="http://schemas.openxmlformats.org/officeDocument/2006/math" xmlns:v="urn:schemas-microsoft-com:vml" xmlns:wp14="http://schemas.microsoft.com/office/word/2010/wordprocessingDrawing" xmlns:wp="http://schemas.openxmlformats.org/drawingml/2006/wordprocessingDrawing" xmlns:w10="urn:schemas-microsoft-com:office:word" xmlns:w="http://schemas.openxmlformats.org/wordprocessingml/2006/main" xmlns:w14="http://schemas.microsoft.com/office/word/2010/wordml" xmlns:w15="http://schemas.microsoft.com/office/word/2012/wordml" xmlns:w16cex="http://schemas.microsoft.com/office/word/2018/wordml/cex" xmlns:w16cid="http://schemas.microsoft.com/office/word/2016/wordml/cid" xmlns:w16="http://schemas.microsoft.com/office/word/2018/wordml" xmlns:w16du="http://schemas.microsoft.com/office/word/2023/wordml/word16du" xmlns:w16sdtdh="http://schemas.microsoft.com/office/word/2020/wordml/sdtdatahash" xmlns:w16sdtfl="http://schemas.microsoft.com/office/word/2024/wordml/sdtformatlock" xmlns:w16se="http://schemas.microsoft.com/office/word/2015/wordml/symex" xmlns:wpg="http://schemas.microsoft.com/office/word/2010/wordprocessingGroup" xmlns:wpi="http://schemas.microsoft.com/office/word/2010/wordprocessingInk" xmlns:wne="http://schemas.microsoft.com/office/word/2006/wordml" xmlns:wps="http://schemas.microsoft.com/office/word/2010/wordprocessingShape" mc:Ignorable="w14 w15 w16se w16cid w16 w16cex w16sdtdh w16sdtfl w16du wp14">
   <w:abstractNum w:abstractNumId="0" w15:restartNumberingAfterBreak="0">
+    <w:nsid w:val="116F7BFD"/>
+    <w:multiLevelType w:val="hybridMultilevel"/>
+    <w:tmpl w:val="C9B6C0E2"/>
+    <w:lvl w:ilvl="0" w:tplc="1F80DFBC">
+      <w:start w:val="1"/>
+      <w:numFmt w:val="decimal"/>
+      <w:lvlText w:val="%1."/>
+      <w:lvlJc w:val="left"/>
+      <w:pPr>
+        <w:ind w:left="800" w:hanging="360"/>
+      </w:pPr>
+      <w:rPr>
+        <w:rFonts w:hint="default"/>
+      </w:rPr>
+    </w:lvl>
+    <w:lvl w:ilvl="1" w:tplc="04090019" w:tentative="1">
+      <w:start w:val="1"/>
+      <w:numFmt w:val="upperLetter"/>
+      <w:lvlText w:val="%2."/>
+      <w:lvlJc w:val="left"/>
+      <w:pPr>
+        <w:ind w:left="1320" w:hanging="440"/>
+      </w:pPr>
+    </w:lvl>
+    <w:lvl w:ilvl="2" w:tplc="0409001B" w:tentative="1">
+      <w:start w:val="1"/>
+      <w:numFmt w:val="lowerRoman"/>
+      <w:lvlText w:val="%3."/>
+      <w:lvlJc w:val="right"/>
+      <w:pPr>
+        <w:ind w:left="1760" w:hanging="440"/>
+      </w:pPr>
+    </w:lvl>
+    <w:lvl w:ilvl="3" w:tplc="0409000F" w:tentative="1">
+      <w:start w:val="1"/>
+      <w:numFmt w:val="decimal"/>
+      <w:lvlText w:val="%4."/>
+      <w:lvlJc w:val="left"/>
+      <w:pPr>
+        <w:ind w:left="2200" w:hanging="440"/>
+      </w:pPr>
+    </w:lvl>
+    <w:lvl w:ilvl="4" w:tplc="04090019" w:tentative="1">
+      <w:start w:val="1"/>
+      <w:numFmt w:val="upperLetter"/>
+      <w:lvlText w:val="%5."/>
+      <w:lvlJc w:val="left"/>
+      <w:pPr>
+        <w:ind w:left="2640" w:hanging="440"/>
+      </w:pPr>
+    </w:lvl>
+    <w:lvl w:ilvl="5" w:tplc="0409001B" w:tentative="1">
+      <w:start w:val="1"/>
+      <w:numFmt w:val="lowerRoman"/>
+      <w:lvlText w:val="%6."/>
+      <w:lvlJc w:val="right"/>
+      <w:pPr>
+        <w:ind w:left="3080" w:hanging="440"/>
+      </w:pPr>
+    </w:lvl>
+    <w:lvl w:ilvl="6" w:tplc="0409000F" w:tentative="1">
+      <w:start w:val="1"/>
+      <w:numFmt w:val="decimal"/>
+      <w:lvlText w:val="%7."/>
+      <w:lvlJc w:val="left"/>
+      <w:pPr>
+        <w:ind w:left="3520" w:hanging="440"/>
+      </w:pPr>
+    </w:lvl>
+    <w:lvl w:ilvl="7" w:tplc="04090019" w:tentative="1">
+      <w:start w:val="1"/>
+      <w:numFmt w:val="upperLetter"/>
+      <w:lvlText w:val="%8."/>
+      <w:lvlJc w:val="left"/>
+      <w:pPr>
+        <w:ind w:left="3960" w:hanging="440"/>
+      </w:pPr>
+    </w:lvl>
+    <w:lvl w:ilvl="8" w:tplc="0409001B" w:tentative="1">
+      <w:start w:val="1"/>
+      <w:numFmt w:val="lowerRoman"/>
+      <w:lvlText w:val="%9."/>
+      <w:lvlJc w:val="right"/>
+      <w:pPr>
+        <w:ind w:left="4400" w:hanging="440"/>
+      </w:pPr>
+    </w:lvl>
+  </w:abstractNum>
+  <w:abstractNum w:abstractNumId="1" w15:restartNumberingAfterBreak="0">
+    <w:nsid w:val="219E6187"/>
+    <w:multiLevelType w:val="hybridMultilevel"/>
+    <w:tmpl w:val="E02E070E"/>
+    <w:lvl w:ilvl="0" w:tplc="AF70039C">
+      <w:start w:val="1"/>
+      <w:numFmt w:val="decimal"/>
+      <w:lvlText w:val="%1."/>
+      <w:lvlJc w:val="left"/>
+      <w:pPr>
+        <w:ind w:left="800" w:hanging="360"/>
+      </w:pPr>
+      <w:rPr>
+        <w:rFonts w:hint="default"/>
+      </w:rPr>
+    </w:lvl>
+    <w:lvl w:ilvl="1" w:tplc="04090019" w:tentative="1">
+      <w:start w:val="1"/>
+      <w:numFmt w:val="upperLetter"/>
+      <w:lvlText w:val="%2."/>
+      <w:lvlJc w:val="left"/>
+      <w:pPr>
+        <w:ind w:left="1320" w:hanging="440"/>
+      </w:pPr>
+    </w:lvl>
+    <w:lvl w:ilvl="2" w:tplc="0409001B" w:tentative="1">
+      <w:start w:val="1"/>
+      <w:numFmt w:val="lowerRoman"/>
+      <w:lvlText w:val="%3."/>
+      <w:lvlJc w:val="right"/>
+      <w:pPr>
+        <w:ind w:left="1760" w:hanging="440"/>
+      </w:pPr>
+    </w:lvl>
+    <w:lvl w:ilvl="3" w:tplc="0409000F" w:tentative="1">
+      <w:start w:val="1"/>
+      <w:numFmt w:val="decimal"/>
+      <w:lvlText w:val="%4."/>
+      <w:lvlJc w:val="left"/>
+      <w:pPr>
+        <w:ind w:left="2200" w:hanging="440"/>
+      </w:pPr>
+    </w:lvl>
+    <w:lvl w:ilvl="4" w:tplc="04090019" w:tentative="1">
+      <w:start w:val="1"/>
+      <w:numFmt w:val="upperLetter"/>
+      <w:lvlText w:val="%5."/>
+      <w:lvlJc w:val="left"/>
+      <w:pPr>
+        <w:ind w:left="2640" w:hanging="440"/>
+      </w:pPr>
+    </w:lvl>
+    <w:lvl w:ilvl="5" w:tplc="0409001B" w:tentative="1">
+      <w:start w:val="1"/>
+      <w:numFmt w:val="lowerRoman"/>
+      <w:lvlText w:val="%6."/>
+      <w:lvlJc w:val="right"/>
+      <w:pPr>
+        <w:ind w:left="3080" w:hanging="440"/>
+      </w:pPr>
+    </w:lvl>
+    <w:lvl w:ilvl="6" w:tplc="0409000F" w:tentative="1">
+      <w:start w:val="1"/>
+      <w:numFmt w:val="decimal"/>
+      <w:lvlText w:val="%7."/>
+      <w:lvlJc w:val="left"/>
+      <w:pPr>
+        <w:ind w:left="3520" w:hanging="440"/>
+      </w:pPr>
+    </w:lvl>
+    <w:lvl w:ilvl="7" w:tplc="04090019" w:tentative="1">
+      <w:start w:val="1"/>
+      <w:numFmt w:val="upperLetter"/>
+      <w:lvlText w:val="%8."/>
+      <w:lvlJc w:val="left"/>
+      <w:pPr>
+        <w:ind w:left="3960" w:hanging="440"/>
+      </w:pPr>
+    </w:lvl>
+    <w:lvl w:ilvl="8" w:tplc="0409001B" w:tentative="1">
+      <w:start w:val="1"/>
+      <w:numFmt w:val="lowerRoman"/>
+      <w:lvlText w:val="%9."/>
+      <w:lvlJc w:val="right"/>
+      <w:pPr>
+        <w:ind w:left="4400" w:hanging="440"/>
+      </w:pPr>
+    </w:lvl>
+  </w:abstractNum>
+  <w:abstractNum w:abstractNumId="2" w15:restartNumberingAfterBreak="0">
     <w:nsid w:val="40F07EE4"/>
     <w:multiLevelType w:val="hybridMultilevel"/>
     <w:tmpl w:val="F32095FA"/>
@@ -1139,7 +1295,96 @@
       </w:rPr>
     </w:lvl>
   </w:abstractNum>
-  <w:abstractNum w:abstractNumId="1" w15:restartNumberingAfterBreak="0">
+  <w:abstractNum w:abstractNumId="3" w15:restartNumberingAfterBreak="0">
+    <w:nsid w:val="52846673"/>
+    <w:multiLevelType w:val="hybridMultilevel"/>
+    <w:tmpl w:val="F580ED78"/>
+    <w:lvl w:ilvl="0" w:tplc="BDA013B8">
+      <w:start w:val="1"/>
+      <w:numFmt w:val="decimal"/>
+      <w:lvlText w:val="%1."/>
+      <w:lvlJc w:val="left"/>
+      <w:pPr>
+        <w:ind w:left="800" w:hanging="360"/>
+      </w:pPr>
+      <w:rPr>
+        <w:rFonts w:hint="default"/>
+      </w:rPr>
+    </w:lvl>
+    <w:lvl w:ilvl="1" w:tplc="04090019" w:tentative="1">
+      <w:start w:val="1"/>
+      <w:numFmt w:val="upperLetter"/>
+      <w:lvlText w:val="%2."/>
+      <w:lvlJc w:val="left"/>
+      <w:pPr>
+        <w:ind w:left="1320" w:hanging="440"/>
+      </w:pPr>
+    </w:lvl>
+    <w:lvl w:ilvl="2" w:tplc="0409001B" w:tentative="1">
+      <w:start w:val="1"/>
+      <w:numFmt w:val="lowerRoman"/>
+      <w:lvlText w:val="%3."/>
+      <w:lvlJc w:val="right"/>
+      <w:pPr>
+        <w:ind w:left="1760" w:hanging="440"/>
+      </w:pPr>
+    </w:lvl>
+    <w:lvl w:ilvl="3" w:tplc="0409000F" w:tentative="1">
+      <w:start w:val="1"/>
+      <w:numFmt w:val="decimal"/>
+      <w:lvlText w:val="%4."/>
+      <w:lvlJc w:val="left"/>
+      <w:pPr>
+        <w:ind w:left="2200" w:hanging="440"/>
+      </w:pPr>
+    </w:lvl>
+    <w:lvl w:ilvl="4" w:tplc="04090019" w:tentative="1">
+      <w:start w:val="1"/>
+      <w:numFmt w:val="upperLetter"/>
+      <w:lvlText w:val="%5."/>
+      <w:lvlJc w:val="left"/>
+      <w:pPr>
+        <w:ind w:left="2640" w:hanging="440"/>
+      </w:pPr>
+    </w:lvl>
+    <w:lvl w:ilvl="5" w:tplc="0409001B" w:tentative="1">
+      <w:start w:val="1"/>
+      <w:numFmt w:val="lowerRoman"/>
+      <w:lvlText w:val="%6."/>
+      <w:lvlJc w:val="right"/>
+      <w:pPr>
+        <w:ind w:left="3080" w:hanging="440"/>
+      </w:pPr>
+    </w:lvl>
+    <w:lvl w:ilvl="6" w:tplc="0409000F" w:tentative="1">
+      <w:start w:val="1"/>
+      <w:numFmt w:val="decimal"/>
+      <w:lvlText w:val="%7."/>
+      <w:lvlJc w:val="left"/>
+      <w:pPr>
+        <w:ind w:left="3520" w:hanging="440"/>
+      </w:pPr>
+    </w:lvl>
+    <w:lvl w:ilvl="7" w:tplc="04090019" w:tentative="1">
+      <w:start w:val="1"/>
+      <w:numFmt w:val="upperLetter"/>
+      <w:lvlText w:val="%8."/>
+      <w:lvlJc w:val="left"/>
+      <w:pPr>
+        <w:ind w:left="3960" w:hanging="440"/>
+      </w:pPr>
+    </w:lvl>
+    <w:lvl w:ilvl="8" w:tplc="0409001B" w:tentative="1">
+      <w:start w:val="1"/>
+      <w:numFmt w:val="lowerRoman"/>
+      <w:lvlText w:val="%9."/>
+      <w:lvlJc w:val="right"/>
+      <w:pPr>
+        <w:ind w:left="4400" w:hanging="440"/>
+      </w:pPr>
+    </w:lvl>
+  </w:abstractNum>
+  <w:abstractNum w:abstractNumId="4" w15:restartNumberingAfterBreak="0">
     <w:nsid w:val="5527761F"/>
     <w:multiLevelType w:val="hybridMultilevel"/>
     <w:tmpl w:val="6A468C20"/>
@@ -1252,7 +1497,7 @@
       </w:rPr>
     </w:lvl>
   </w:abstractNum>
-  <w:abstractNum w:abstractNumId="2" w15:restartNumberingAfterBreak="0">
+  <w:abstractNum w:abstractNumId="5" w15:restartNumberingAfterBreak="0">
     <w:nsid w:val="55C415BB"/>
     <w:multiLevelType w:val="hybridMultilevel"/>
     <w:tmpl w:val="0A9ED440"/>
@@ -1365,7 +1610,7 @@
       </w:rPr>
     </w:lvl>
   </w:abstractNum>
-  <w:abstractNum w:abstractNumId="3" w15:restartNumberingAfterBreak="0">
+  <w:abstractNum w:abstractNumId="6" w15:restartNumberingAfterBreak="0">
     <w:nsid w:val="63D23F62"/>
     <w:multiLevelType w:val="hybridMultilevel"/>
     <w:tmpl w:val="14822A7E"/>
@@ -1478,7 +1723,7 @@
       </w:rPr>
     </w:lvl>
   </w:abstractNum>
-  <w:abstractNum w:abstractNumId="4" w15:restartNumberingAfterBreak="0">
+  <w:abstractNum w:abstractNumId="7" w15:restartNumberingAfterBreak="0">
     <w:nsid w:val="7CD24BF1"/>
     <w:multiLevelType w:val="hybridMultilevel"/>
     <w:tmpl w:val="496ACBD4"/>
@@ -1591,26 +1836,35 @@
       </w:rPr>
     </w:lvl>
   </w:abstractNum>
-  <w:num w:numId="1">
+  <w:num w:numId="1" w16cid:durableId="1242518589">
+    <w:abstractNumId w:val="5"/>
+  </w:num>
+  <w:num w:numId="2" w16cid:durableId="1264806740">
+    <w:abstractNumId w:val="4"/>
+  </w:num>
+  <w:num w:numId="3" w16cid:durableId="2094475533">
     <w:abstractNumId w:val="2"/>
   </w:num>
-  <w:num w:numId="2">
+  <w:num w:numId="4" w16cid:durableId="889616035">
+    <w:abstractNumId w:val="7"/>
+  </w:num>
+  <w:num w:numId="5" w16cid:durableId="1400984047">
+    <w:abstractNumId w:val="6"/>
+  </w:num>
+  <w:num w:numId="6" w16cid:durableId="1865092452">
     <w:abstractNumId w:val="1"/>
   </w:num>
-  <w:num w:numId="3">
+  <w:num w:numId="7" w16cid:durableId="489564713">
     <w:abstractNumId w:val="0"/>
   </w:num>
-  <w:num w:numId="4">
-    <w:abstractNumId w:val="4"/>
-  </w:num>
-  <w:num w:numId="5">
+  <w:num w:numId="8" w16cid:durableId="671227083">
     <w:abstractNumId w:val="3"/>
   </w:num>
 </w:numbering>
 </file>
 
 <file path=word/styles.xml><?xml version="1.0" encoding="utf-8"?>
-<w:styles xmlns:mc="http://schemas.openxmlformats.org/markup-compatibility/2006" xmlns:r="http://schemas.openxmlformats.org/officeDocument/2006/relationships" xmlns:w="http://schemas.openxmlformats.org/wordprocessingml/2006/main" xmlns:w14="http://schemas.microsoft.com/office/word/2010/wordml" xmlns:w15="http://schemas.microsoft.com/office/word/2012/wordml" xmlns:w16se="http://schemas.microsoft.com/office/word/2015/wordml/symex" mc:Ignorable="w14 w15 w16se">
+<w:styles xmlns:mc="http://schemas.openxmlformats.org/markup-compatibility/2006" xmlns:r="http://schemas.openxmlformats.org/officeDocument/2006/relationships" xmlns:w="http://schemas.openxmlformats.org/wordprocessingml/2006/main" xmlns:w14="http://schemas.microsoft.com/office/word/2010/wordml" xmlns:w15="http://schemas.microsoft.com/office/word/2012/wordml" xmlns:w16cex="http://schemas.microsoft.com/office/word/2018/wordml/cex" xmlns:w16cid="http://schemas.microsoft.com/office/word/2016/wordml/cid" xmlns:w16="http://schemas.microsoft.com/office/word/2018/wordml" xmlns:w16du="http://schemas.microsoft.com/office/word/2023/wordml/word16du" xmlns:w16sdtdh="http://schemas.microsoft.com/office/word/2020/wordml/sdtdatahash" xmlns:w16sdtfl="http://schemas.microsoft.com/office/word/2024/wordml/sdtformatlock" xmlns:w16se="http://schemas.microsoft.com/office/word/2015/wordml/symex" mc:Ignorable="w14 w15 w16se w16cid w16 w16cex w16sdtdh w16sdtfl w16du">
   <w:docDefaults>
     <w:rPrDefault>
       <w:rPr>
@@ -1627,7 +1881,7 @@
       </w:pPr>
     </w:pPrDefault>
   </w:docDefaults>
-  <w:latentStyles w:defLockedState="0" w:defUIPriority="0" w:defSemiHidden="0" w:defUnhideWhenUsed="0" w:defQFormat="0" w:count="371">
+  <w:latentStyles w:defLockedState="0" w:defUIPriority="0" w:defSemiHidden="0" w:defUnhideWhenUsed="0" w:defQFormat="0" w:count="376">
     <w:lsdException w:name="Normal" w:qFormat="1"/>
     <w:lsdException w:name="heading 1" w:uiPriority="9" w:qFormat="1"/>
     <w:lsdException w:name="heading 2" w:semiHidden="1" w:uiPriority="9" w:unhideWhenUsed="1" w:qFormat="1"/>
@@ -1894,6 +2148,11 @@
     <w:lsdException w:name="Book Title" w:qFormat="1"/>
     <w:lsdException w:name="Bibliography" w:semiHidden="1" w:unhideWhenUsed="1"/>
     <w:lsdException w:name="TOC Heading" w:semiHidden="1" w:unhideWhenUsed="1" w:qFormat="1"/>
+    <w:lsdException w:name="Mention" w:semiHidden="1" w:uiPriority="99" w:unhideWhenUsed="1"/>
+    <w:lsdException w:name="Smart Hyperlink" w:semiHidden="1" w:uiPriority="99" w:unhideWhenUsed="1"/>
+    <w:lsdException w:name="Hashtag" w:semiHidden="1" w:uiPriority="99" w:unhideWhenUsed="1"/>
+    <w:lsdException w:name="Unresolved Mention" w:semiHidden="1" w:uiPriority="99" w:unhideWhenUsed="1"/>
+    <w:lsdException w:name="Smart Link" w:semiHidden="1" w:uiPriority="99" w:unhideWhenUsed="1"/>
   </w:latentStyles>
   <w:style w:type="paragraph" w:default="1" w:styleId="a">
     <w:name w:val="Normal"/>

</xml_diff>